<commit_message>
fix: insert Zenodo DOI, reconcile analysis script, trim policy section
- Data availability: Zenodo DOI 10.5281/zenodo.20844884 inserted
- analysis/vbp_analysis_fixes.py: 2015-2025 health/all-industry wages
  and ratio series reconciled to match Table 1 (was np.nan/1.21x draft)
- Policy-scenario and cost-benefit section trimmed (~750->400 words)
- References renumbered 1-48; Huayiwang duplicate merged; superscripts
- verified_data.py: 2015-2018 and 2025 NBS values filled

Co-Authored-By: Claude <noreply@anthropic.com>
</commit_message>
<xml_diff>
--- a/VBP_Health_Wage_Decline_revised.docx
+++ b/VBP_Health_Wage_Decline_revised.docx
@@ -10728,19 +10728,19 @@
         <w:t xml:space="preserve"> </w:t>
       </w:r>
       <w:r>
-        <w:t xml:space="preserve">at https://github.com/tongyuanzhongzhi/vbp-itm-china and will be archived</w:t>
-      </w:r>
-      <w:r>
-        <w:t xml:space="preserve"> </w:t>
-      </w:r>
-      <w:r>
-        <w:t xml:space="preserve">with a Zenodo DOI [pending assignment at acceptance]. All data are from</w:t>
-      </w:r>
-      <w:r>
-        <w:t xml:space="preserve"> </w:t>
-      </w:r>
-      <w:r>
-        <w:t xml:space="preserve">publicly available</w:t>
+        <w:t xml:space="preserve">at https://github.com/tongyuanzhongzhi/vbp-itm-china, archived at</w:t>
+      </w:r>
+      <w:r>
+        <w:t xml:space="preserve"> </w:t>
+      </w:r>
+      <w:r>
+        <w:t xml:space="preserve">https://doi.org/10.5281/zenodo.20844884. All data are from publicly</w:t>
+      </w:r>
+      <w:r>
+        <w:t xml:space="preserve"> </w:t>
+      </w:r>
+      <w:r>
+        <w:t xml:space="preserve">available</w:t>
       </w:r>
       <w:r>
         <w:t xml:space="preserve"> </w:t>

</xml_diff>

<commit_message>
fix: correct Chengdu DRG case numerical error (890m -> 8.9m yuan)
- Cardiac-surgery DRG overrun corrected from ¥890 million to ¥8.90
  million (890万元), matching the source media report (100x error)
- Rephrased as 'a reported case' without formal citation (source is
  an AI-generated media article of low academic authority)

Co-Authored-By: Claude <noreply@anthropic.com>
</commit_message>
<xml_diff>
--- a/VBP_Health_Wage_Decline_revised.docx
+++ b/VBP_Health_Wage_Decline_revised.docx
@@ -9186,31 +9186,37 @@
         <w:t xml:space="preserve"> </w:t>
       </w:r>
       <w:r>
-        <w:t xml:space="preserve">through performance-based pay. The Chengdu tertiary hospital</w:t>
-      </w:r>
-      <w:r>
-        <w:t xml:space="preserve"> </w:t>
-      </w:r>
-      <w:r>
-        <w:t xml:space="preserve">case—where cardiac surgery DRG overruns of ¥890 million resulted in a</w:t>
-      </w:r>
-      <w:r>
-        <w:t xml:space="preserve"> </w:t>
-      </w:r>
-      <w:r>
-        <w:t xml:space="preserve">37% department-wide income decline—illustrates this transmission: the</w:t>
-      </w:r>
-      <w:r>
-        <w:t xml:space="preserve"> </w:t>
-      </w:r>
-      <w:r>
-        <w:t xml:space="preserve">overrun was an institutional-level financial event, but the</w:t>
-      </w:r>
-      <w:r>
-        <w:t xml:space="preserve"> </w:t>
-      </w:r>
-      <w:r>
-        <w:t xml:space="preserve">performance-pay mechanism converted it into personal income loss.</w:t>
+        <w:t xml:space="preserve">through performance-based pay. A reported case in which cardiac-surgery</w:t>
+      </w:r>
+      <w:r>
+        <w:t xml:space="preserve"> </w:t>
+      </w:r>
+      <w:r>
+        <w:t xml:space="preserve">DRG overruns of ¥8.90 million at a Chengdu tertiary hospital were fully</w:t>
+      </w:r>
+      <w:r>
+        <w:t xml:space="preserve"> </w:t>
+      </w:r>
+      <w:r>
+        <w:t xml:space="preserve">deducted from departmental performance pay, with average physician</w:t>
+      </w:r>
+      <w:r>
+        <w:t xml:space="preserve"> </w:t>
+      </w:r>
+      <w:r>
+        <w:t xml:space="preserve">income declining by 37%, illustrates this transmission: the overrun was</w:t>
+      </w:r>
+      <w:r>
+        <w:t xml:space="preserve"> </w:t>
+      </w:r>
+      <w:r>
+        <w:t xml:space="preserve">an institutional-level financial event, but the performance-pay</w:t>
+      </w:r>
+      <w:r>
+        <w:t xml:space="preserve"> </w:t>
+      </w:r>
+      <w:r>
+        <w:t xml:space="preserve">mechanism converted it into personal income loss.</w:t>
       </w:r>
       <w:r>
         <w:t xml:space="preserve"> </w:t>

</xml_diff>

<commit_message>
fix: correct systematic citation renumbering error (refs 6-30)
Final QA found 19 in-text citations shifted down by 1 due to wrong
renumbering logic (delete-ref-5 applied instead of delete-ref-31).
JPA 5->6, MHLW 7->8, CMDA 28->29, Dingxiangyuan 29->30, Scheffler
26->27, etc. All 48 refs now content-matched. See MODIFICATIONS.md L.

Co-Authored-By: Claude <noreply@anthropic.com>
</commit_message>
<xml_diff>
--- a/VBP_Health_Wage_Decline_revised.docx
+++ b/VBP_Health_Wage_Decline_revised.docx
@@ -598,7 +598,7 @@
         <w:rPr>
           <w:vertAlign w:val="superscript"/>
         </w:rPr>
-        <w:t xml:space="preserve">15,38</w:t>
+        <w:t xml:space="preserve">16,38</w:t>
       </w:r>
       <w:r>
         <w:t xml:space="preserve"> </w:t>
@@ -954,7 +954,7 @@
         <w:rPr>
           <w:vertAlign w:val="superscript"/>
         </w:rPr>
-        <w:t xml:space="preserve">5,7</w:t>
+        <w:t xml:space="preserve">6,8</w:t>
       </w:r>
       <w:r>
         <w:t xml:space="preserve"> </w:t>
@@ -984,7 +984,7 @@
         <w:rPr>
           <w:vertAlign w:val="superscript"/>
         </w:rPr>
-        <w:t xml:space="preserve">5</w:t>
+        <w:t xml:space="preserve">6</w:t>
       </w:r>
       <w:r>
         <w:t xml:space="preserve"> </w:t>
@@ -1150,7 +1150,7 @@
         <w:rPr>
           <w:vertAlign w:val="superscript"/>
         </w:rPr>
-        <w:t xml:space="preserve">4,12,13</w:t>
+        <w:t xml:space="preserve">4,13,14</w:t>
       </w:r>
       <w:r>
         <w:t xml:space="preserve"> </w:t>
@@ -1234,7 +1234,7 @@
         <w:rPr>
           <w:vertAlign w:val="superscript"/>
         </w:rPr>
-        <w:t xml:space="preserve">14</w:t>
+        <w:t xml:space="preserve">15</w:t>
       </w:r>
       <w:r>
         <w:t xml:space="preserve"> </w:t>
@@ -1270,7 +1270,7 @@
         <w:rPr>
           <w:vertAlign w:val="superscript"/>
         </w:rPr>
-        <w:t xml:space="preserve">5–7</w:t>
+        <w:t xml:space="preserve">6–8</w:t>
       </w:r>
       <w:r>
         <w:t xml:space="preserve"> </w:t>
@@ -1300,7 +1300,7 @@
         <w:rPr>
           <w:vertAlign w:val="superscript"/>
         </w:rPr>
-        <w:t xml:space="preserve">15–18</w:t>
+        <w:t xml:space="preserve">16–19</w:t>
       </w:r>
       <w:r>
         <w:t xml:space="preserve"> </w:t>
@@ -1671,7 +1671,7 @@
         <w:rPr>
           <w:vertAlign w:val="superscript"/>
         </w:rPr>
-        <w:t xml:space="preserve">28</w:t>
+        <w:t xml:space="preserve">29</w:t>
       </w:r>
       <w:r>
         <w:t xml:space="preserve">; (2) the 2024 China Hospital Human Resources Survey (n=2,009</w:t>
@@ -1686,7 +1686,7 @@
         <w:rPr>
           <w:vertAlign w:val="superscript"/>
         </w:rPr>
-        <w:t xml:space="preserve">29</w:t>
+        <w:t xml:space="preserve">30</w:t>
       </w:r>
       <w:r>
         <w:t xml:space="preserve">; (3) the 2024 Medical Talent Salary</w:t>
@@ -2231,7 +2231,7 @@
         <w:rPr>
           <w:vertAlign w:val="superscript"/>
         </w:rPr>
-        <w:t xml:space="preserve">25</w:t>
+        <w:t xml:space="preserve">26</w:t>
       </w:r>
       <w:r>
         <w:t xml:space="preserve"> </w:t>
@@ -2267,7 +2267,7 @@
         <w:rPr>
           <w:vertAlign w:val="superscript"/>
         </w:rPr>
-        <w:t xml:space="preserve">8,19</w:t>
+        <w:t xml:space="preserve">9,20</w:t>
       </w:r>
       <w:r>
         <w:t xml:space="preserve"> </w:t>
@@ -2279,7 +2279,7 @@
         <w:rPr>
           <w:vertAlign w:val="superscript"/>
         </w:rPr>
-        <w:t xml:space="preserve">9–11,20</w:t>
+        <w:t xml:space="preserve">10–12,21</w:t>
       </w:r>
       <w:r>
         <w:t xml:space="preserve"> </w:t>
@@ -2457,7 +2457,7 @@
         <w:rPr>
           <w:vertAlign w:val="superscript"/>
         </w:rPr>
-        <w:t xml:space="preserve">21</w:t>
+        <w:t xml:space="preserve">22</w:t>
       </w:r>
       <w:r>
         <w:t xml:space="preserve"> </w:t>
@@ -2821,7 +2821,7 @@
         <w:rPr>
           <w:vertAlign w:val="superscript"/>
         </w:rPr>
-        <w:t xml:space="preserve">22</w:t>
+        <w:t xml:space="preserve">23</w:t>
       </w:r>
       <w:r>
         <w:t xml:space="preserve"> </w:t>
@@ -2901,7 +2901,7 @@
         <w:rPr>
           <w:vertAlign w:val="superscript"/>
         </w:rPr>
-        <w:t xml:space="preserve">23</w:t>
+        <w:t xml:space="preserve">24</w:t>
       </w:r>
       <w:r>
         <w:t xml:space="preserve"> </w:t>
@@ -2913,7 +2913,7 @@
         <w:rPr>
           <w:vertAlign w:val="superscript"/>
         </w:rPr>
-        <w:t xml:space="preserve">24</w:t>
+        <w:t xml:space="preserve">25</w:t>
       </w:r>
       <w:r>
         <w:t xml:space="preserve"> </w:t>
@@ -6705,7 +6705,7 @@
         <w:rPr>
           <w:vertAlign w:val="superscript"/>
         </w:rPr>
-        <w:t xml:space="preserve">15,17,18</w:t>
+        <w:t xml:space="preserve">16,18,19</w:t>
       </w:r>
       <w:r>
         <w:t xml:space="preserve"> </w:t>
@@ -9383,7 +9383,7 @@
         <w:rPr>
           <w:vertAlign w:val="superscript"/>
         </w:rPr>
-        <w:t xml:space="preserve">26</w:t>
+        <w:t xml:space="preserve">27</w:t>
       </w:r>
       <w:r>
         <w:t xml:space="preserve">; attribution to wage trends requires further study.</w:t>
@@ -10086,7 +10086,7 @@
         <w:rPr>
           <w:vertAlign w:val="superscript"/>
         </w:rPr>
-        <w:t xml:space="preserve">16,27</w:t>
+        <w:t xml:space="preserve">17,28</w:t>
       </w:r>
       <w:r>
         <w:t xml:space="preserve"> </w:t>

</xml_diff>

<commit_message>
fix: correct ref 1 (Yao->Chen et al, JPHP->Front Pharmacol 2021)
CrossRef/PubMed verification found ref 1 cited wrong author (Yao J) and
journal (J Pharm Policy Pract). Correct: Chen Y et al, Front Pharmacol
2021;12:804237 (DOI 10.3389/fphar.2021.804237). All other refs verified
accurate. See MODIFICATIONS.md M.

Co-Authored-By: Claude <noreply@anthropic.com>
</commit_message>
<xml_diff>
--- a/VBP_Health_Wage_Decline_revised.docx
+++ b/VBP_Health_Wage_Decline_revised.docx
@@ -10928,19 +10928,19 @@
         <w:pStyle w:val="BodyText"/>
       </w:pPr>
       <w:r>
-        <w:t xml:space="preserve">1. Yao J, et al. Impact of the pilot volume-based drug purchasing</w:t>
-      </w:r>
-      <w:r>
-        <w:t xml:space="preserve"> </w:t>
-      </w:r>
-      <w:r>
-        <w:t xml:space="preserve">policy in China: interrupted time-series analysis with controls. J Pharm</w:t>
-      </w:r>
-      <w:r>
-        <w:t xml:space="preserve"> </w:t>
-      </w:r>
-      <w:r>
-        <w:t xml:space="preserve">Policy Pract. 2022;15(1):46.</w:t>
+        <w:t xml:space="preserve">1. Chen Y, Ji X, Xiao H, Unger JM, Cai Y, Mao Z, et al. Impact of the</w:t>
+      </w:r>
+      <w:r>
+        <w:t xml:space="preserve"> </w:t>
+      </w:r>
+      <w:r>
+        <w:t xml:space="preserve">pilot volume-based drug purchasing policy in China: interrupted</w:t>
+      </w:r>
+      <w:r>
+        <w:t xml:space="preserve"> </w:t>
+      </w:r>
+      <w:r>
+        <w:t xml:space="preserve">time-series analysis with controls. Front Pharmacol. 2021;12:804237.</w:t>
       </w:r>
     </w:p>
     <w:p>

</xml_diff>

<commit_message>
style: author affiliation numbers as superscripts
Per SSM/Elsevier format: author institution numbers (1,2) and
corresponding-author marker (*) set as superscripts (was inline).

Co-Authored-By: Claude <noreply@anthropic.com>
</commit_message>
<xml_diff>
--- a/VBP_Health_Wage_Decline_revised.docx
+++ b/VBP_Health_Wage_Decline_revised.docx
@@ -47,7 +47,22 @@
         <w:pStyle w:val="BodyText"/>
       </w:pPr>
       <w:r>
-        <w:t xml:space="preserve">Zhensheng Dai1*, Yueling Jin2</w:t>
+        <w:t xml:space="preserve">Zhensheng Dai</w:t>
+      </w:r>
+      <w:r>
+        <w:rPr>
+          <w:vertAlign w:val="superscript"/>
+        </w:rPr>
+        <w:t xml:space="preserve">1,*</w:t>
+      </w:r>
+      <w:r>
+        <w:t xml:space="preserve">, Yueling Jin</w:t>
+      </w:r>
+      <w:r>
+        <w:rPr>
+          <w:vertAlign w:val="superscript"/>
+        </w:rPr>
+        <w:t xml:space="preserve">2</w:t>
       </w:r>
     </w:p>
     <w:p>

</xml_diff>